<commit_message>
Premium: corrige contrato (1.1 = entregáveis reais do pacote; 1.2 = adicionais opcionais pagos, não mais bônus grátis) + pop-up de adicionais alinhado à imagem (Audens Finance /ano, Estratégias de Promoções; anual não soma no /mês)
</commit_message>
<xml_diff>
--- a/assets/contratos/contrato-premium.docx
+++ b/assets/contratos/contrato-premium.docx
@@ -224,176 +224,188 @@
           <w:sz w:val="22"/>
           <w:szCs w:val="22"/>
         </w:rPr>
-        <w:t xml:space="preserve">a) Gestão de tráfego pago (Meta Ads);</w:t>
-      </w:r>
-    </w:p>
-    <w:p>
-      <w:pPr>
-        <w:spacing w:after="60"/>
-        <w:ind w:left="360"/>
-      </w:pPr>
-      <w:r>
-        <w:rPr>
-          <w:rFonts w:ascii="Arial" w:cs="Arial" w:eastAsia="Arial" w:hAnsi="Arial"/>
-          <w:sz w:val="22"/>
-          <w:szCs w:val="22"/>
-        </w:rPr>
-        <w:t xml:space="preserve">b) Criação, edição e otimização de anúncios;</w:t>
-      </w:r>
-    </w:p>
-    <w:p>
-      <w:pPr>
-        <w:spacing w:after="60"/>
-        <w:ind w:left="360"/>
-      </w:pPr>
-      <w:r>
-        <w:rPr>
-          <w:rFonts w:ascii="Arial" w:cs="Arial" w:eastAsia="Arial" w:hAnsi="Arial"/>
-          <w:sz w:val="22"/>
-          <w:szCs w:val="22"/>
-        </w:rPr>
-        <w:t xml:space="preserve">c) Organização e otimização de cardápio digital;</w:t>
-      </w:r>
-    </w:p>
-    <w:p>
-      <w:pPr>
-        <w:spacing w:after="60"/>
-        <w:ind w:left="360"/>
-      </w:pPr>
-      <w:r>
-        <w:rPr>
-          <w:rFonts w:ascii="Arial" w:cs="Arial" w:eastAsia="Arial" w:hAnsi="Arial"/>
-          <w:sz w:val="22"/>
-          <w:szCs w:val="22"/>
-        </w:rPr>
-        <w:t xml:space="preserve">d) Disparo de mensagens e ações de relacionamento;</w:t>
-      </w:r>
-    </w:p>
-    <w:p>
-      <w:pPr>
-        <w:spacing w:after="60"/>
-        <w:ind w:left="360"/>
-      </w:pPr>
-      <w:r>
-        <w:rPr>
-          <w:rFonts w:ascii="Arial" w:cs="Arial" w:eastAsia="Arial" w:hAnsi="Arial"/>
-          <w:sz w:val="22"/>
-          <w:szCs w:val="22"/>
-        </w:rPr>
-        <w:t xml:space="preserve">e) Relatórios periódicos com métricas e análises de desempenho;</w:t>
-      </w:r>
-    </w:p>
-    <w:p>
-      <w:pPr>
-        <w:spacing w:after="60"/>
-        <w:ind w:left="360"/>
-      </w:pPr>
-      <w:r>
-        <w:rPr>
-          <w:rFonts w:ascii="Arial" w:cs="Arial" w:eastAsia="Arial" w:hAnsi="Arial"/>
-          <w:sz w:val="22"/>
-          <w:szCs w:val="22"/>
-        </w:rPr>
-        <w:t xml:space="preserve">f) Desenvolvimento de produtos, combos e promoções;</w:t>
-      </w:r>
-    </w:p>
-    <w:p>
-      <w:pPr>
-        <w:spacing w:after="60"/>
-        <w:ind w:left="360"/>
-      </w:pPr>
-      <w:r>
-        <w:rPr>
-          <w:rFonts w:ascii="Arial" w:cs="Arial" w:eastAsia="Arial" w:hAnsi="Arial"/>
-          <w:sz w:val="22"/>
-          <w:szCs w:val="22"/>
-        </w:rPr>
-        <w:t xml:space="preserve">g) Acesso ao curso "Feed que dá Fome";</w:t>
-      </w:r>
-    </w:p>
-    <w:p>
-      <w:pPr>
-        <w:spacing w:after="60"/>
-        <w:ind w:left="360"/>
-      </w:pPr>
-      <w:r>
-        <w:rPr>
-          <w:rFonts w:ascii="Arial" w:cs="Arial" w:eastAsia="Arial" w:hAnsi="Arial"/>
-          <w:sz w:val="22"/>
-          <w:szCs w:val="22"/>
-        </w:rPr>
-        <w:t xml:space="preserve">h) Acesso à pasta de referências estratégicas da Audens Company;</w:t>
-      </w:r>
-    </w:p>
-    <w:p>
-      <w:pPr>
-        <w:spacing w:after="60"/>
-        <w:ind w:left="360"/>
-      </w:pPr>
-      <w:r>
-        <w:rPr>
-          <w:rFonts w:ascii="Arial" w:cs="Arial" w:eastAsia="Arial" w:hAnsi="Arial"/>
-          <w:sz w:val="22"/>
-          <w:szCs w:val="22"/>
-        </w:rPr>
-        <w:t xml:space="preserve">i) Suporte via WhatsApp em horário comercial.</w:t>
-      </w:r>
-    </w:p>
-    <w:p>
-      <w:pPr>
-        <w:spacing w:after="160"/>
-      </w:pPr>
-      <w:r>
-        <w:rPr>
-          <w:rFonts w:ascii="Arial" w:cs="Arial" w:eastAsia="Arial" w:hAnsi="Arial"/>
-          <w:sz w:val="22"/>
-          <w:szCs w:val="22"/>
-        </w:rPr>
-        <w:t xml:space="preserve">1.2. Além dos serviços descritos na cláusula 1.1, ficam incluídos como adicionais do plano, sem cobrança extra, durante todo o período de vigência contratual (</w:t>
-      </w:r>
-      <w:r>
-        <w:rPr>
-          <w:rFonts w:ascii="Arial" w:cs="Arial" w:eastAsia="Arial" w:hAnsi="Arial"/>
-          <w:sz w:val="22"/>
-          <w:szCs w:val="22"/>
-        </w:rPr>
-        <w:t xml:space="preserve">{duracao_meses} meses</w:t>
-      </w:r>
-      <w:r>
-        <w:rPr>
-          <w:rFonts w:ascii="Arial" w:cs="Arial" w:eastAsia="Arial" w:hAnsi="Arial"/>
-          <w:sz w:val="22"/>
-          <w:szCs w:val="22"/>
-        </w:rPr>
-        <w:t xml:space="preserve">), os seguintes bônus:</w:t>
-      </w:r>
-    </w:p>
-    <w:p>
-      <w:pPr>
-        <w:spacing w:after="60"/>
-        <w:ind w:left="360"/>
-      </w:pPr>
-      <w:r>
-        <w:rPr>
-          <w:rFonts w:ascii="Arial" w:cs="Arial" w:eastAsia="Arial" w:hAnsi="Arial"/>
-          <w:sz w:val="22"/>
-          <w:szCs w:val="22"/>
-        </w:rPr>
-        <w:t xml:space="preserve">a) Gestão de iFood e 99Food;</w:t>
-      </w:r>
-    </w:p>
-    <w:p>
-      <w:pPr>
-        <w:spacing w:after="60"/>
-        <w:ind w:left="360"/>
-      </w:pPr>
-      <w:r>
-        <w:rPr>
-          <w:rFonts w:ascii="Arial" w:cs="Arial" w:eastAsia="Arial" w:hAnsi="Arial"/>
-          <w:sz w:val="22"/>
-          <w:szCs w:val="22"/>
-        </w:rPr>
-        <w:t xml:space="preserve">b) Criação de Cardápio Digital.</w:t>
+        <w:t xml:space="preserve">a) Gestão de Tráfego Pago Especializada (Meta Ads);</w:t>
+      </w:r>
+    </w:p>
+    <w:p>
+      <w:pPr>
+        <w:spacing w:after="60"/>
+        <w:ind w:left="360"/>
+      </w:pPr>
+      <w:r>
+        <w:rPr>
+          <w:rFonts w:ascii="Arial" w:cs="Arial" w:eastAsia="Arial" w:hAnsi="Arial"/>
+          <w:sz w:val="22"/>
+          <w:szCs w:val="22"/>
+        </w:rPr>
+        <w:t xml:space="preserve">b) Edição de até 5 (cinco) criativos para tráfego, mensalmente;</w:t>
+      </w:r>
+    </w:p>
+    <w:p>
+      <w:pPr>
+        <w:spacing w:after="60"/>
+        <w:ind w:left="360"/>
+      </w:pPr>
+      <w:r>
+        <w:rPr>
+          <w:rFonts w:ascii="Arial" w:cs="Arial" w:eastAsia="Arial" w:hAnsi="Arial"/>
+          <w:sz w:val="22"/>
+          <w:szCs w:val="22"/>
+        </w:rPr>
+        <w:t xml:space="preserve">c) Análise e estruturação do Cardápio Digital;</w:t>
+      </w:r>
+    </w:p>
+    <w:p>
+      <w:pPr>
+        <w:spacing w:after="60"/>
+        <w:ind w:left="360"/>
+      </w:pPr>
+      <w:r>
+        <w:rPr>
+          <w:rFonts w:ascii="Arial" w:cs="Arial" w:eastAsia="Arial" w:hAnsi="Arial"/>
+          <w:sz w:val="22"/>
+          <w:szCs w:val="22"/>
+        </w:rPr>
+        <w:t xml:space="preserve">d) Relatórios das métricas das campanhas;</w:t>
+      </w:r>
+    </w:p>
+    <w:p>
+      <w:pPr>
+        <w:spacing w:after="60"/>
+        <w:ind w:left="360"/>
+      </w:pPr>
+      <w:r>
+        <w:rPr>
+          <w:rFonts w:ascii="Arial" w:cs="Arial" w:eastAsia="Arial" w:hAnsi="Arial"/>
+          <w:sz w:val="22"/>
+          <w:szCs w:val="22"/>
+        </w:rPr>
+        <w:t xml:space="preserve">e) Estratégias focadas na captação de novos clientes;</w:t>
+      </w:r>
+    </w:p>
+    <w:p>
+      <w:pPr>
+        <w:spacing w:after="60"/>
+        <w:ind w:left="360"/>
+      </w:pPr>
+      <w:r>
+        <w:rPr>
+          <w:rFonts w:ascii="Arial" w:cs="Arial" w:eastAsia="Arial" w:hAnsi="Arial"/>
+          <w:sz w:val="22"/>
+          <w:szCs w:val="22"/>
+        </w:rPr>
+        <w:t xml:space="preserve">f) Estratégias focadas na retenção dos clientes;</w:t>
+      </w:r>
+    </w:p>
+    <w:p>
+      <w:pPr>
+        <w:spacing w:after="60"/>
+        <w:ind w:left="360"/>
+      </w:pPr>
+      <w:r>
+        <w:rPr>
+          <w:rFonts w:ascii="Arial" w:cs="Arial" w:eastAsia="Arial" w:hAnsi="Arial"/>
+          <w:sz w:val="22"/>
+          <w:szCs w:val="22"/>
+        </w:rPr>
+        <w:t xml:space="preserve">g) Suporte via WhatsApp em horário comercial.</w:t>
+      </w:r>
+    </w:p>
+    <w:p>
+      <w:pPr>
+        <w:spacing w:after="60"/>
+      </w:pPr>
+      <w:r>
+        <w:rPr>
+          <w:rFonts w:ascii="Arial" w:cs="Arial" w:eastAsia="Arial" w:hAnsi="Arial"/>
+          <w:sz w:val="22"/>
+          <w:szCs w:val="22"/>
+        </w:rPr>
+        <w:t xml:space="preserve">1.2. A CONTRATANTE poderá contratar, de forma opcional e mediante cobrança à parte, os seguintes serviços adicionais, conforme selecionado no ato da contratação:</w:t>
+      </w:r>
+    </w:p>
+    <w:p>
+      <w:pPr>
+        <w:spacing w:after="60"/>
+        <w:ind w:left="360"/>
+      </w:pPr>
+      <w:r>
+        <w:rPr>
+          <w:rFonts w:ascii="Arial" w:cs="Arial" w:eastAsia="Arial" w:hAnsi="Arial"/>
+          <w:sz w:val="22"/>
+          <w:szCs w:val="22"/>
+        </w:rPr>
+        <w:t xml:space="preserve">a) Gestão de iFood — R$ 600,00/mês;</w:t>
+      </w:r>
+    </w:p>
+    <w:p>
+      <w:pPr>
+        <w:spacing w:after="60"/>
+        <w:ind w:left="360"/>
+      </w:pPr>
+      <w:r>
+        <w:rPr>
+          <w:rFonts w:ascii="Arial" w:cs="Arial" w:eastAsia="Arial" w:hAnsi="Arial"/>
+          <w:sz w:val="22"/>
+          <w:szCs w:val="22"/>
+        </w:rPr>
+        <w:t xml:space="preserve">b) Gestão de 99Food — R$ 600,00/mês;</w:t>
+      </w:r>
+    </w:p>
+    <w:p>
+      <w:pPr>
+        <w:spacing w:after="60"/>
+        <w:ind w:left="360"/>
+      </w:pPr>
+      <w:r>
+        <w:rPr>
+          <w:rFonts w:ascii="Arial" w:cs="Arial" w:eastAsia="Arial" w:hAnsi="Arial"/>
+          <w:sz w:val="22"/>
+          <w:szCs w:val="22"/>
+        </w:rPr>
+        <w:t xml:space="preserve">c) Audens Finance — R$ 599,00/ano;</w:t>
+      </w:r>
+    </w:p>
+    <w:p>
+      <w:pPr>
+        <w:spacing w:after="60"/>
+        <w:ind w:left="360"/>
+      </w:pPr>
+      <w:r>
+        <w:rPr>
+          <w:rFonts w:ascii="Arial" w:cs="Arial" w:eastAsia="Arial" w:hAnsi="Arial"/>
+          <w:sz w:val="22"/>
+          <w:szCs w:val="22"/>
+        </w:rPr>
+        <w:t xml:space="preserve">d) Gestão de CRM (Estratégia de Retenção Audens Pro + Repediu, até 5 campanhas ativas por mês) — R$ 800,00/mês;</w:t>
+      </w:r>
+    </w:p>
+    <w:p>
+      <w:pPr>
+        <w:spacing w:after="60"/>
+        <w:ind w:left="360"/>
+      </w:pPr>
+      <w:r>
+        <w:rPr>
+          <w:rFonts w:ascii="Arial" w:cs="Arial" w:eastAsia="Arial" w:hAnsi="Arial"/>
+          <w:sz w:val="22"/>
+          <w:szCs w:val="22"/>
+        </w:rPr>
+        <w:t xml:space="preserve">e) Criação de Cardápio Digital — R$ 300,00/mês;</w:t>
+      </w:r>
+    </w:p>
+    <w:p>
+      <w:pPr>
+        <w:spacing w:after="60"/>
+        <w:ind w:left="360"/>
+      </w:pPr>
+      <w:r>
+        <w:rPr>
+          <w:rFonts w:ascii="Arial" w:cs="Arial" w:eastAsia="Arial" w:hAnsi="Arial"/>
+          <w:sz w:val="22"/>
+          <w:szCs w:val="22"/>
+        </w:rPr>
+        <w:t xml:space="preserve">f) Estratégias de Promoções — R$ 500,00/mês.</w:t>
       </w:r>
     </w:p>
     <w:p>

</xml_diff>

<commit_message>
Premium 1.2: adicionais dinâmicos — só os selecionados no pop-up entram no contrato (loop docxtemplater), com preço e /mês ou /ano; sem duplicar na cláusula de pagamento
</commit_message>
<xml_diff>
--- a/assets/contratos/contrato-premium.docx
+++ b/assets/contratos/contrato-premium.docx
@@ -321,91 +321,21 @@
           <w:sz w:val="22"/>
           <w:szCs w:val="22"/>
         </w:rPr>
-        <w:t xml:space="preserve">1.2. A CONTRATANTE poderá contratar, de forma opcional e mediante cobrança à parte, os seguintes serviços adicionais, conforme selecionado no ato da contratação:</w:t>
-      </w:r>
-    </w:p>
-    <w:p>
-      <w:pPr>
-        <w:spacing w:after="60"/>
-        <w:ind w:left="360"/>
-      </w:pPr>
-      <w:r>
-        <w:rPr>
-          <w:rFonts w:ascii="Arial" w:cs="Arial" w:eastAsia="Arial" w:hAnsi="Arial"/>
-          <w:sz w:val="22"/>
-          <w:szCs w:val="22"/>
-        </w:rPr>
-        <w:t xml:space="preserve">a) Gestão de iFood — R$ 600,00/mês;</w:t>
-      </w:r>
-    </w:p>
-    <w:p>
-      <w:pPr>
-        <w:spacing w:after="60"/>
-        <w:ind w:left="360"/>
-      </w:pPr>
-      <w:r>
-        <w:rPr>
-          <w:rFonts w:ascii="Arial" w:cs="Arial" w:eastAsia="Arial" w:hAnsi="Arial"/>
-          <w:sz w:val="22"/>
-          <w:szCs w:val="22"/>
-        </w:rPr>
-        <w:t xml:space="preserve">b) Gestão de 99Food — R$ 600,00/mês;</w:t>
-      </w:r>
-    </w:p>
-    <w:p>
-      <w:pPr>
-        <w:spacing w:after="60"/>
-        <w:ind w:left="360"/>
-      </w:pPr>
-      <w:r>
-        <w:rPr>
-          <w:rFonts w:ascii="Arial" w:cs="Arial" w:eastAsia="Arial" w:hAnsi="Arial"/>
-          <w:sz w:val="22"/>
-          <w:szCs w:val="22"/>
-        </w:rPr>
-        <w:t xml:space="preserve">c) Audens Finance — R$ 599,00/ano;</w:t>
-      </w:r>
-    </w:p>
-    <w:p>
-      <w:pPr>
-        <w:spacing w:after="60"/>
-        <w:ind w:left="360"/>
-      </w:pPr>
-      <w:r>
-        <w:rPr>
-          <w:rFonts w:ascii="Arial" w:cs="Arial" w:eastAsia="Arial" w:hAnsi="Arial"/>
-          <w:sz w:val="22"/>
-          <w:szCs w:val="22"/>
-        </w:rPr>
-        <w:t xml:space="preserve">d) Gestão de CRM (Estratégia de Retenção Audens Pro + Repediu, até 5 campanhas ativas por mês) — R$ 800,00/mês;</w:t>
-      </w:r>
-    </w:p>
-    <w:p>
-      <w:pPr>
-        <w:spacing w:after="60"/>
-        <w:ind w:left="360"/>
-      </w:pPr>
-      <w:r>
-        <w:rPr>
-          <w:rFonts w:ascii="Arial" w:cs="Arial" w:eastAsia="Arial" w:hAnsi="Arial"/>
-          <w:sz w:val="22"/>
-          <w:szCs w:val="22"/>
-        </w:rPr>
-        <w:t xml:space="preserve">e) Criação de Cardápio Digital — R$ 300,00/mês;</w:t>
-      </w:r>
-    </w:p>
-    <w:p>
-      <w:pPr>
-        <w:spacing w:after="60"/>
-        <w:ind w:left="360"/>
-      </w:pPr>
-      <w:r>
-        <w:rPr>
-          <w:rFonts w:ascii="Arial" w:cs="Arial" w:eastAsia="Arial" w:hAnsi="Arial"/>
-          <w:sz w:val="22"/>
-          <w:szCs w:val="22"/>
-        </w:rPr>
-        <w:t xml:space="preserve">f) Estratégias de Promoções — R$ 500,00/mês.</w:t>
+        <w:t xml:space="preserve">1.2. Os serviços adicionais opcionais contratados pela CONTRATANTE, cobrados à parte, são os seguintes:</w:t>
+      </w:r>
+    </w:p>
+    <w:p>
+      <w:pPr>
+        <w:spacing w:after="60"/>
+        <w:ind w:left="360"/>
+      </w:pPr>
+      <w:r>
+        <w:rPr>
+          <w:rFonts w:ascii="Arial" w:cs="Arial" w:eastAsia="Arial" w:hAnsi="Arial"/>
+          <w:sz w:val="22"/>
+          <w:szCs w:val="22"/>
+        </w:rPr>
+        <w:t xml:space="preserve">{#adicionaisSel}{linha}{/adicionaisSel}</w:t>
       </w:r>
     </w:p>
     <w:p>

</xml_diff>

<commit_message>
Premium: sem adicional selecionado, a cláusula 1.2 é omitida e a de mídia paga vira 1.2 (numeração dinâmica via docxtemplater)
</commit_message>
<xml_diff>
--- a/assets/contratos/contrato-premium.docx
+++ b/assets/contratos/contrato-premium.docx
@@ -321,34 +321,34 @@
           <w:sz w:val="22"/>
           <w:szCs w:val="22"/>
         </w:rPr>
-        <w:t xml:space="preserve">1.2. Os serviços adicionais opcionais contratados pela CONTRATANTE, cobrados à parte, são os seguintes:</w:t>
-      </w:r>
-    </w:p>
-    <w:p>
-      <w:pPr>
-        <w:spacing w:after="60"/>
-        <w:ind w:left="360"/>
-      </w:pPr>
-      <w:r>
-        <w:rPr>
-          <w:rFonts w:ascii="Arial" w:cs="Arial" w:eastAsia="Arial" w:hAnsi="Arial"/>
-          <w:sz w:val="22"/>
-          <w:szCs w:val="22"/>
-        </w:rPr>
-        <w:t xml:space="preserve">{#adicionaisSel}{linha}{/adicionaisSel}</w:t>
-      </w:r>
-    </w:p>
-    <w:p>
-      <w:pPr>
-        <w:spacing w:after="160"/>
-      </w:pPr>
-      <w:r>
-        <w:rPr>
-          <w:rFonts w:ascii="Arial" w:cs="Arial" w:eastAsia="Arial" w:hAnsi="Arial"/>
-          <w:sz w:val="22"/>
-          <w:szCs w:val="22"/>
-        </w:rPr>
-        <w:t xml:space="preserve">1.3. Os valores investidos em mídia paga não estão inclusos neste contrato, sendo de responsabilidade exclusiva da CONTRATANTE.</w:t>
+        <w:t xml:space="preserve">{#temAdicionais}1.2. Os serviços adicionais opcionais contratados pela CONTRATANTE, cobrados à parte, são os seguintes:</w:t>
+      </w:r>
+    </w:p>
+    <w:p>
+      <w:pPr>
+        <w:spacing w:after="60"/>
+        <w:ind w:left="360"/>
+      </w:pPr>
+      <w:r>
+        <w:rPr>
+          <w:rFonts w:ascii="Arial" w:cs="Arial" w:eastAsia="Arial" w:hAnsi="Arial"/>
+          <w:sz w:val="22"/>
+          <w:szCs w:val="22"/>
+        </w:rPr>
+        <w:t xml:space="preserve">{#adicionaisSel}{linha}{/adicionaisSel}{/temAdicionais}</w:t>
+      </w:r>
+    </w:p>
+    <w:p>
+      <w:pPr>
+        <w:spacing w:after="160"/>
+      </w:pPr>
+      <w:r>
+        <w:rPr>
+          <w:rFonts w:ascii="Arial" w:cs="Arial" w:eastAsia="Arial" w:hAnsi="Arial"/>
+          <w:sz w:val="22"/>
+          <w:szCs w:val="22"/>
+        </w:rPr>
+        <w:t xml:space="preserve">{clausulaMidia}. Os valores investidos em mídia paga não estão inclusos neste contrato, sendo de responsabilidade exclusiva da CONTRATANTE.</w:t>
       </w:r>
     </w:p>
     <w:p>

</xml_diff>